<commit_message>
remarks to lab 3
</commit_message>
<xml_diff>
--- a/lab3/ОтчётИсходник.docx
+++ b/lab3/ОтчётИсходник.docx
@@ -2862,7 +2862,7 @@
             <w:noProof/>
             <w:webHidden/>
           </w:rPr>
-          <w:t>14</w:t>
+          <w:t>15</w:t>
         </w:r>
         <w:r>
           <w:rPr>
@@ -2932,7 +2932,7 @@
             <w:noProof/>
             <w:webHidden/>
           </w:rPr>
-          <w:t>14</w:t>
+          <w:t>15</w:t>
         </w:r>
         <w:r>
           <w:rPr>
@@ -22025,15 +22025,7 @@
         </m:r>
       </m:oMath>
       <w:r>
-        <w:t xml:space="preserve"> (таблица 2), поэтому допусковые множества расположены вокруг одной точки (рисун</w:t>
-      </w:r>
-      <w:proofErr w:type="spellStart"/>
-      <w:r>
-        <w:t>ки</w:t>
-      </w:r>
-      <w:proofErr w:type="spellEnd"/>
-      <w:r>
-        <w:t xml:space="preserve"> 2, 4, 6).</w:t>
+        <w:t xml:space="preserve"> (таблица 2), поэтому допусковые множества расположены вокруг одной точки (рисунки 2, 4, 6).</w:t>
       </w:r>
     </w:p>
     <w:p>
@@ -22100,6 +22092,424 @@
       </w:r>
       <w:r>
         <w:t>сильнее всего искажает данные A-коррекция.</w:t>
+      </w:r>
+    </w:p>
+    <w:p>
+      <w:pPr>
+        <w:spacing w:after="120"/>
+        <w:jc w:val="both"/>
+      </w:pPr>
+    </w:p>
+    <w:p>
+      <w:pPr>
+        <w:spacing w:after="120"/>
+        <w:jc w:val="both"/>
+      </w:pPr>
+      <w:r>
+        <w:t>В дополнение</w:t>
+      </w:r>
+      <w:r>
+        <w:t xml:space="preserve">, </w:t>
+      </w:r>
+      <w:r>
+        <w:t>существуют остальные виды множеств решений интервальных уравнений.</w:t>
+      </w:r>
+    </w:p>
+    <w:p>
+      <w:pPr>
+        <w:spacing w:after="120"/>
+        <w:jc w:val="both"/>
+      </w:pPr>
+      <w:r>
+        <w:t xml:space="preserve">Управляемое </w:t>
+      </w:r>
+      <w:r>
+        <w:t>множество решений ИСЛАУ:</w:t>
+      </w:r>
+    </w:p>
+    <w:p>
+      <w:pPr>
+        <w:spacing w:before="60" w:after="120"/>
+        <w:jc w:val="center"/>
+      </w:pPr>
+      <m:oMathPara>
+        <m:oMath>
+          <m:sSub>
+            <m:sSubPr>
+              <m:ctrlPr>
+                <w:rPr>
+                  <w:rFonts w:ascii="Cambria Math" w:hAnsi="Cambria Math"/>
+                </w:rPr>
+              </m:ctrlPr>
+            </m:sSubPr>
+            <m:e>
+              <m:r>
+                <w:rPr>
+                  <w:rFonts w:ascii="Cambria Math" w:hAnsi="Cambria Math"/>
+                </w:rPr>
+                <m:t>Ξ</m:t>
+              </m:r>
+            </m:e>
+            <m:sub>
+              <m:r>
+                <w:rPr>
+                  <w:rFonts w:ascii="Cambria Math" w:hAnsi="Cambria Math"/>
+                </w:rPr>
+                <m:t>ctl</m:t>
+              </m:r>
+            </m:sub>
+          </m:sSub>
+          <m:r>
+            <w:rPr>
+              <w:rFonts w:ascii="Cambria Math" w:hAnsi="Cambria Math"/>
+            </w:rPr>
+            <m:t>(</m:t>
+          </m:r>
+          <m:r>
+            <m:rPr>
+              <m:sty m:val="bi"/>
+            </m:rPr>
+            <w:rPr>
+              <w:rFonts w:ascii="Cambria Math" w:hAnsi="Cambria Math"/>
+            </w:rPr>
+            <m:t>A</m:t>
+          </m:r>
+          <m:r>
+            <w:rPr>
+              <w:rFonts w:ascii="Cambria Math" w:hAnsi="Cambria Math"/>
+            </w:rPr>
+            <m:t>, </m:t>
+          </m:r>
+          <m:r>
+            <m:rPr>
+              <m:sty m:val="bi"/>
+            </m:rPr>
+            <w:rPr>
+              <w:rFonts w:ascii="Cambria Math" w:hAnsi="Cambria Math"/>
+            </w:rPr>
+            <m:t>b</m:t>
+          </m:r>
+          <m:r>
+            <w:rPr>
+              <w:rFonts w:ascii="Cambria Math" w:hAnsi="Cambria Math"/>
+            </w:rPr>
+            <m:t>)={x∈</m:t>
+          </m:r>
+          <m:sSup>
+            <m:sSupPr>
+              <m:ctrlPr>
+                <w:rPr>
+                  <w:rFonts w:ascii="Cambria Math" w:hAnsi="Cambria Math"/>
+                </w:rPr>
+              </m:ctrlPr>
+            </m:sSupPr>
+            <m:e>
+              <m:r>
+                <m:rPr>
+                  <m:scr m:val="double-struck"/>
+                </m:rPr>
+                <w:rPr>
+                  <w:rFonts w:ascii="Cambria Math" w:hAnsi="Cambria Math"/>
+                </w:rPr>
+                <m:t>R</m:t>
+              </m:r>
+            </m:e>
+            <m:sup>
+              <m:r>
+                <w:rPr>
+                  <w:rFonts w:ascii="Cambria Math" w:hAnsi="Cambria Math"/>
+                </w:rPr>
+                <m:t>n</m:t>
+              </m:r>
+            </m:sup>
+          </m:sSup>
+          <m:r>
+            <w:rPr>
+              <w:rFonts w:ascii="Cambria Math" w:hAnsi="Cambria Math"/>
+            </w:rPr>
+            <m:t>|</m:t>
+          </m:r>
+          <m:r>
+            <m:rPr>
+              <m:sty m:val="bi"/>
+            </m:rPr>
+            <w:rPr>
+              <w:rFonts w:ascii="Cambria Math" w:hAnsi="Cambria Math"/>
+            </w:rPr>
+            <m:t>A</m:t>
+          </m:r>
+          <m:r>
+            <w:rPr>
+              <w:rFonts w:ascii="Cambria Math" w:hAnsi="Cambria Math"/>
+            </w:rPr>
+            <m:t>x</m:t>
+          </m:r>
+          <m:r>
+            <w:rPr>
+              <w:rFonts w:ascii="Cambria Math" w:hAnsi="Cambria Math"/>
+            </w:rPr>
+            <m:t>⊇</m:t>
+          </m:r>
+          <m:r>
+            <m:rPr>
+              <m:sty m:val="bi"/>
+            </m:rPr>
+            <w:rPr>
+              <w:rFonts w:ascii="Cambria Math" w:hAnsi="Cambria Math"/>
+            </w:rPr>
+            <m:t>b</m:t>
+          </m:r>
+          <m:r>
+            <w:rPr>
+              <w:rFonts w:ascii="Cambria Math" w:hAnsi="Cambria Math"/>
+            </w:rPr>
+            <m:t>}.</m:t>
+          </m:r>
+        </m:oMath>
+      </m:oMathPara>
+    </w:p>
+    <w:p>
+      <w:pPr>
+        <w:spacing w:before="60" w:after="120"/>
+      </w:pPr>
+      <w:r>
+        <w:t>Суть в том</w:t>
+      </w:r>
+      <w:r>
+        <w:t xml:space="preserve">, </w:t>
+      </w:r>
+      <w:r>
+        <w:t xml:space="preserve">что для любого </w:t>
+      </w:r>
+      <w:r>
+        <w:rPr>
+          <w:lang w:val="en-US"/>
+        </w:rPr>
+        <w:t>b</w:t>
+      </w:r>
+      <w:r>
+        <w:t xml:space="preserve"> </w:t>
+      </w:r>
+      <w:r>
+        <w:t xml:space="preserve">существует </w:t>
+      </w:r>
+      <w:r>
+        <w:rPr>
+          <w:lang w:val="en-US"/>
+        </w:rPr>
+        <w:t>A</w:t>
+      </w:r>
+      <w:r>
+        <w:t xml:space="preserve"> такое</w:t>
+      </w:r>
+      <w:r>
+        <w:t xml:space="preserve">, </w:t>
+      </w:r>
+      <w:r>
+        <w:t xml:space="preserve">что </w:t>
+      </w:r>
+      <w:r>
+        <w:rPr>
+          <w:lang w:val="en-US"/>
+        </w:rPr>
+        <w:t>Ax</w:t>
+      </w:r>
+      <w:r>
+        <w:t xml:space="preserve"> </w:t>
+      </w:r>
+      <w:r>
+        <w:t>=</w:t>
+      </w:r>
+      <w:r>
+        <w:t xml:space="preserve"> </w:t>
+      </w:r>
+      <w:r>
+        <w:rPr>
+          <w:lang w:val="en-US"/>
+        </w:rPr>
+        <w:t>b</w:t>
+      </w:r>
+      <w:r>
+        <w:t>.</w:t>
+      </w:r>
+      <w:r>
+        <w:t xml:space="preserve"> То есть в данном случае выходы</w:t>
+      </w:r>
+      <w:r>
+        <w:t>(</w:t>
+      </w:r>
+      <w:r>
+        <w:rPr>
+          <w:lang w:val="en-US"/>
+        </w:rPr>
+        <w:t>b</w:t>
+      </w:r>
+      <w:r>
+        <w:t xml:space="preserve">) </w:t>
+      </w:r>
+      <w:r>
+        <w:t>управляют входами (</w:t>
+      </w:r>
+      <w:r>
+        <w:rPr>
+          <w:lang w:val="en-US"/>
+        </w:rPr>
+        <w:t>A</w:t>
+      </w:r>
+      <w:r>
+        <w:t xml:space="preserve">), </w:t>
+      </w:r>
+      <w:r>
+        <w:t>это может использоваться в случае</w:t>
+      </w:r>
+      <w:r>
+        <w:t xml:space="preserve">, </w:t>
+      </w:r>
+      <w:r>
+        <w:t>когда мы хотим понять</w:t>
+      </w:r>
+      <w:r>
+        <w:t xml:space="preserve">, </w:t>
+      </w:r>
+      <w:r>
+        <w:t xml:space="preserve">существует ли решение для заданной </w:t>
+      </w:r>
+      <w:r>
+        <w:t>“</w:t>
+      </w:r>
+      <w:r>
+        <w:t>высоты</w:t>
+      </w:r>
+      <w:r>
+        <w:t>”</w:t>
+      </w:r>
+      <w:r>
+        <w:t xml:space="preserve"> </w:t>
+      </w:r>
+      <w:r>
+        <w:rPr>
+          <w:lang w:val="en-US"/>
+        </w:rPr>
+        <w:t>b</w:t>
+      </w:r>
+      <w:r>
+        <w:t xml:space="preserve"> с каким-то доверительным интервалом</w:t>
+      </w:r>
+      <w:r>
+        <w:t>.</w:t>
+      </w:r>
+    </w:p>
+    <w:p>
+      <w:pPr>
+        <w:spacing w:after="120"/>
+        <w:jc w:val="both"/>
+      </w:pPr>
+      <w:r>
+        <w:t xml:space="preserve">Объединённое </w:t>
+      </w:r>
+      <w:r>
+        <w:t>множество решений ИСЛАУ:</w:t>
+      </w:r>
+    </w:p>
+    <w:p>
+      <w:pPr>
+        <w:spacing w:after="120"/>
+        <w:jc w:val="both"/>
+      </w:pPr>
+      <w:r>
+        <w:t xml:space="preserve">В </w:t>
+      </w:r>
+      <w:proofErr w:type="spellStart"/>
+      <w:r>
+        <w:t>кванторной</w:t>
+      </w:r>
+      <w:proofErr w:type="spellEnd"/>
+      <w:r>
+        <w:t xml:space="preserve"> форме</w:t>
+      </w:r>
+      <w:r>
+        <w:t xml:space="preserve">: </w:t>
+      </w:r>
+      <w:r>
+        <w:t xml:space="preserve">существует </w:t>
+      </w:r>
+      <w:r>
+        <w:rPr>
+          <w:lang w:val="en-US"/>
+        </w:rPr>
+        <w:t>b</w:t>
+      </w:r>
+      <w:r>
+        <w:t xml:space="preserve"> </w:t>
+      </w:r>
+      <w:r>
+        <w:t xml:space="preserve">и существует </w:t>
+      </w:r>
+      <w:r>
+        <w:rPr>
+          <w:lang w:val="en-US"/>
+        </w:rPr>
+        <w:t>A</w:t>
+      </w:r>
+      <w:r>
+        <w:t xml:space="preserve"> </w:t>
+      </w:r>
+      <w:r>
+        <w:t>такие</w:t>
+      </w:r>
+      <w:r>
+        <w:t xml:space="preserve">, </w:t>
+      </w:r>
+      <w:r>
+        <w:t xml:space="preserve">что </w:t>
+      </w:r>
+      <w:r>
+        <w:rPr>
+          <w:lang w:val="en-US"/>
+        </w:rPr>
+        <w:t>Ax</w:t>
+      </w:r>
+      <w:r>
+        <w:t xml:space="preserve"> = </w:t>
+      </w:r>
+      <w:r>
+        <w:rPr>
+          <w:lang w:val="en-US"/>
+        </w:rPr>
+        <w:t>b</w:t>
+      </w:r>
+      <w:r>
+        <w:t xml:space="preserve">. </w:t>
+      </w:r>
+      <w:r>
+        <w:t>Это самое общее множество решений</w:t>
+      </w:r>
+      <w:r>
+        <w:t xml:space="preserve">, </w:t>
+      </w:r>
+      <w:r>
+        <w:t>так как оно требует хотя бы одного существующего решения для всего ИСЛАУ.</w:t>
+      </w:r>
+      <w:r>
+        <w:t xml:space="preserve"> Оно может быть использовано для первоначальной проверки множества</w:t>
+      </w:r>
+      <w:r>
+        <w:t xml:space="preserve">, </w:t>
+      </w:r>
+      <w:r>
+        <w:t>так как</w:t>
+      </w:r>
+      <w:r>
+        <w:t xml:space="preserve">, </w:t>
+      </w:r>
+      <w:r>
+        <w:t>если даже объединённое множество пусто</w:t>
+      </w:r>
+      <w:r>
+        <w:t xml:space="preserve">, </w:t>
+      </w:r>
+      <w:r>
+        <w:t>то остальное точно.</w:t>
       </w:r>
     </w:p>
     <w:p>
@@ -22325,6 +22735,7 @@
       </w:pPr>
       <w:bookmarkStart w:id="30" w:name="_Toc242908458"/>
       <w:r>
+        <w:lastRenderedPageBreak/>
         <w:t>Список литературы</w:t>
       </w:r>
       <w:bookmarkEnd w:id="30"/>
@@ -24257,7 +24668,7 @@
   <w:style w:type="paragraph" w:default="1" w:styleId="a">
     <w:name w:val="Normal"/>
     <w:qFormat/>
-    <w:rsid w:val="00675695"/>
+    <w:rsid w:val="008962C4"/>
     <w:pPr>
       <w:widowControl w:val="0"/>
       <w:autoSpaceDE w:val="0"/>

</xml_diff>